<commit_message>
docs(examples): expand word/formulas.sh to cover full LaTeX feature surface
Adds 25 examples (31-55) covering matrices (pmatrix/bmatrix/vmatrix),
cases, auto-sized delimiters (left/right with various bracket types,
floor/ceiling), overbrace/underbrace/overset, math fonts (mathbb/cal/
bf/rm), cancel/cancelto/boxed, accents (bar/vec/tilde/ddot/overline),
hyperbolic and inverse trig, operatorname, modular arithmetic, double
integral with text, big operators (bigcup/bigcap/coprod), full uppercase
Greek set, matrix dots (cdots/vdots/ddots), spacing controls, textcolor,
set theory, norm and inner product.
</commit_message>
<xml_diff>
--- a/examples/word/formulas.docx
+++ b/examples/word/formulas.docx
@@ -119,7 +119,7 @@
             </m:sup>
             <m:e>
               <m:r>
-                <m:t xml:space="preserve"> </m:t>
+                <m:t xml:space="preserve"/>
               </m:r>
             </m:e>
           </m:nary>
@@ -297,174 +297,171 @@
     <w:p>
       <m:oMathPara>
         <m:oMath>
+          <m:sSup>
+            <m:e>
+              <m:nary>
+                <m:naryPr>
+                  <m:chr m:val="∫"/>
+                </m:naryPr>
+                <m:sub>
+                  <m:r>
+                    <m:t xml:space="preserve">-</m:t>
+                  </m:r>
+                  <m:r>
+                    <m:t xml:space="preserve">∞</m:t>
+                  </m:r>
+                </m:sub>
+                <m:sup>
+                  <m:r>
+                    <m:t xml:space="preserve">+</m:t>
+                  </m:r>
+                  <m:r>
+                    <m:t xml:space="preserve">∞</m:t>
+                  </m:r>
+                </m:sup>
+                <m:e>
+                  <m:r>
+                    <m:t xml:space="preserve">e</m:t>
+                  </m:r>
+                </m:e>
+              </m:nary>
+            </m:e>
+            <m:sup>
+              <m:sSup>
+                <m:e>
+                  <m:r>
+                    <m:t xml:space="preserve">-x</m:t>
+                  </m:r>
+                </m:e>
+                <m:sup>
+                  <m:r>
+                    <m:t xml:space="preserve">2</m:t>
+                  </m:r>
+                </m:sup>
+              </m:sSup>
+            </m:sup>
+          </m:sSup>
+          <m:r>
+            <m:t xml:space="preserve"> dx = </m:t>
+          </m:r>
+          <m:rad>
+            <m:radPr>
+              <m:degHide m:val="true"/>
+            </m:radPr>
+            <m:deg/>
+            <m:e>
+              <m:r>
+                <m:t xml:space="preserve">π</m:t>
+              </m:r>
+            </m:e>
+          </m:rad>
+        </m:oMath>
+      </m:oMathPara>
+    </w:p>
+    <w:p>
+      <w:pPr/>
+      <w:r>
+        <w:rPr/>
+        <w:t xml:space="preserve">6. Taylor Series Expansion:</w:t>
+      </w:r>
+    </w:p>
+    <w:p>
+      <m:oMathPara>
+        <m:oMath>
+          <m:r>
+            <m:t xml:space="preserve">f(x) = </m:t>
+          </m:r>
+          <m:nary>
+            <m:naryPr>
+              <m:chr m:val="∑"/>
+            </m:naryPr>
+            <m:sub>
+              <m:r>
+                <m:t xml:space="preserve">n=0</m:t>
+              </m:r>
+            </m:sub>
+            <m:sup>
+              <m:r>
+                <m:t xml:space="preserve">∞</m:t>
+              </m:r>
+            </m:sup>
+            <m:e>
+              <m:r>
+                <m:t xml:space="preserve"/>
+              </m:r>
+            </m:e>
+          </m:nary>
+          <m:f>
+            <m:num>
+              <m:sSup>
+                <m:e>
+                  <m:r>
+                    <m:t xml:space="preserve">f</m:t>
+                  </m:r>
+                </m:e>
+                <m:sup>
+                  <m:r>
+                    <m:t xml:space="preserve">(n)</m:t>
+                  </m:r>
+                </m:sup>
+              </m:sSup>
+              <m:r>
+                <m:t xml:space="preserve">(a)</m:t>
+              </m:r>
+            </m:num>
+            <m:den>
+              <m:r>
+                <m:t xml:space="preserve">n!</m:t>
+              </m:r>
+            </m:den>
+          </m:f>
+          <m:sSup>
+            <m:e>
+              <m:r>
+                <m:t xml:space="preserve"> (x-a)</m:t>
+              </m:r>
+            </m:e>
+            <m:sup>
+              <m:r>
+                <m:t xml:space="preserve">n</m:t>
+              </m:r>
+            </m:sup>
+          </m:sSup>
+        </m:oMath>
+      </m:oMathPara>
+    </w:p>
+    <w:p>
+      <w:pPr/>
+      <w:r>
+        <w:rPr/>
+        <w:t xml:space="preserve">7. Newton-Leibniz Formula:</w:t>
+      </w:r>
+    </w:p>
+    <w:p>
+      <m:oMathPara>
+        <m:oMath>
           <m:nary>
             <m:naryPr>
               <m:chr m:val="∫"/>
             </m:naryPr>
             <m:sub>
               <m:r>
-                <m:t xml:space="preserve">-</m:t>
-              </m:r>
-              <m:r>
-                <m:t xml:space="preserve">∞</m:t>
+                <m:t xml:space="preserve">a</m:t>
               </m:r>
             </m:sub>
             <m:sup>
               <m:r>
-                <m:t xml:space="preserve">+</m:t>
-              </m:r>
-              <m:r>
-                <m:t xml:space="preserve">∞</m:t>
+                <m:t xml:space="preserve">b</m:t>
               </m:r>
             </m:sup>
             <m:e>
               <m:r>
-                <m:t xml:space="preserve"> </m:t>
+                <m:t xml:space="preserve">f</m:t>
               </m:r>
             </m:e>
           </m:nary>
-          <m:sSup>
-            <m:e>
-              <m:r>
-                <m:t xml:space="preserve">e</m:t>
-              </m:r>
-            </m:e>
-            <m:sup>
-              <m:sSup>
-                <m:e>
-                  <m:r>
-                    <m:t xml:space="preserve">-x</m:t>
-                  </m:r>
-                </m:e>
-                <m:sup>
-                  <m:r>
-                    <m:t xml:space="preserve">2</m:t>
-                  </m:r>
-                </m:sup>
-              </m:sSup>
-            </m:sup>
-          </m:sSup>
-          <m:r>
-            <m:t xml:space="preserve"> dx = </m:t>
-          </m:r>
-          <m:rad>
-            <m:radPr>
-              <m:degHide m:val="true"/>
-            </m:radPr>
-            <m:deg/>
-            <m:e>
-              <m:r>
-                <m:t xml:space="preserve">π</m:t>
-              </m:r>
-            </m:e>
-          </m:rad>
-        </m:oMath>
-      </m:oMathPara>
-    </w:p>
-    <w:p>
-      <w:pPr/>
-      <w:r>
-        <w:rPr/>
-        <w:t xml:space="preserve">6. Taylor Series Expansion:</w:t>
-      </w:r>
-    </w:p>
-    <w:p>
-      <m:oMathPara>
-        <m:oMath>
-          <m:r>
-            <m:t xml:space="preserve">f(x) = </m:t>
-          </m:r>
-          <m:nary>
-            <m:naryPr>
-              <m:chr m:val="∑"/>
-            </m:naryPr>
-            <m:sub>
-              <m:r>
-                <m:t xml:space="preserve">n=0</m:t>
-              </m:r>
-            </m:sub>
-            <m:sup>
-              <m:r>
-                <m:t xml:space="preserve">∞</m:t>
-              </m:r>
-            </m:sup>
-            <m:e>
-              <m:r>
-                <m:t xml:space="preserve"> </m:t>
-              </m:r>
-            </m:e>
-          </m:nary>
-          <m:f>
-            <m:num>
-              <m:sSup>
-                <m:e>
-                  <m:r>
-                    <m:t xml:space="preserve">f</m:t>
-                  </m:r>
-                </m:e>
-                <m:sup>
-                  <m:r>
-                    <m:t xml:space="preserve">(n)</m:t>
-                  </m:r>
-                </m:sup>
-              </m:sSup>
-              <m:r>
-                <m:t xml:space="preserve">(a)</m:t>
-              </m:r>
-            </m:num>
-            <m:den>
-              <m:r>
-                <m:t xml:space="preserve">n!</m:t>
-              </m:r>
-            </m:den>
-          </m:f>
-          <m:sSup>
-            <m:e>
-              <m:r>
-                <m:t xml:space="preserve"> (x-a)</m:t>
-              </m:r>
-            </m:e>
-            <m:sup>
-              <m:r>
-                <m:t xml:space="preserve">n</m:t>
-              </m:r>
-            </m:sup>
-          </m:sSup>
-        </m:oMath>
-      </m:oMathPara>
-    </w:p>
-    <w:p>
-      <w:pPr/>
-      <w:r>
-        <w:rPr/>
-        <w:t xml:space="preserve">7. Newton-Leibniz Formula:</w:t>
-      </w:r>
-    </w:p>
-    <w:p>
-      <m:oMathPara>
-        <m:oMath>
-          <m:nary>
-            <m:naryPr>
-              <m:chr m:val="∫"/>
-            </m:naryPr>
-            <m:sub>
-              <m:r>
-                <m:t xml:space="preserve">a</m:t>
-              </m:r>
-            </m:sub>
-            <m:sup>
-              <m:r>
-                <m:t xml:space="preserve">b</m:t>
-              </m:r>
-            </m:sup>
-            <m:e>
-              <m:r>
-                <m:t xml:space="preserve"> </m:t>
-              </m:r>
-            </m:e>
-          </m:nary>
-          <m:r>
-            <m:t xml:space="preserve">f(x) dx = F(b) - F(a)</m:t>
+          <m:r>
+            <m:t xml:space="preserve">(x) dx = F(b) - F(a)</m:t>
           </m:r>
         </m:oMath>
       </m:oMathPara>
@@ -492,12 +489,12 @@
             <m:sup/>
             <m:e>
               <m:r>
-                <m:t xml:space="preserve"> </m:t>
+                <m:t xml:space="preserve">f</m:t>
               </m:r>
             </m:e>
           </m:nary>
           <m:r>
-            <m:t xml:space="preserve">f(r, </m:t>
+            <m:t xml:space="preserve">(r, </m:t>
           </m:r>
           <m:r>
             <m:t xml:space="preserve">θ</m:t>
@@ -616,14 +613,14 @@
             </m:sup>
             <m:e>
               <m:r>
-                <m:t xml:space="preserve"> </m:t>
+                <m:t xml:space="preserve">f</m:t>
               </m:r>
             </m:e>
           </m:nary>
           <m:sSup>
             <m:e>
               <m:r>
-                <m:t xml:space="preserve">f(x) e</m:t>
+                <m:t xml:space="preserve">(x) e</m:t>
               </m:r>
             </m:e>
             <m:sup>
@@ -879,14 +876,14 @@
             </m:sup>
             <m:e>
               <m:r>
-                <m:t xml:space="preserve"> </m:t>
+                <m:t xml:space="preserve">(</m:t>
               </m:r>
             </m:e>
           </m:nary>
           <m:sSub>
             <m:e>
               <m:r>
-                <m:t xml:space="preserve">(x</m:t>
+                <m:t xml:space="preserve">x</m:t>
               </m:r>
             </m:e>
             <m:sub>
@@ -957,7 +954,7 @@
             </m:sup>
             <m:e>
               <m:r>
-                <m:t xml:space="preserve"> </m:t>
+                <m:t xml:space="preserve"/>
               </m:r>
             </m:e>
           </m:nary>
@@ -2449,6 +2446,2300 @@
         </m:oMath>
       </m:oMathPara>
     </w:p>
+    <w:p>
+      <w:pPr>
+        <w:pStyle w:val="Heading2"/>
+      </w:pPr>
+      <w:r>
+        <w:rPr/>
+        <w:t xml:space="preserve">VIII. Advanced Notation</w:t>
+      </w:r>
+    </w:p>
+    <w:p>
+      <w:pPr/>
+      <w:r>
+        <w:rPr/>
+        <w:t xml:space="preserve">31. Matrix (pmatrix):</w:t>
+      </w:r>
+    </w:p>
+    <w:p>
+      <m:oMathPara>
+        <m:oMath>
+          <m:r>
+            <m:t xml:space="preserve">A = </m:t>
+          </m:r>
+          <m:d>
+            <m:dPr/>
+            <m:e>
+              <m:m>
+                <m:mPr/>
+                <m:mr>
+                  <m:e>
+                    <m:sSub>
+                      <m:e>
+                        <m:r>
+                          <m:t xml:space="preserve"> a</m:t>
+                        </m:r>
+                      </m:e>
+                      <m:sub>
+                        <m:r>
+                          <m:t xml:space="preserve">11</m:t>
+                        </m:r>
+                      </m:sub>
+                    </m:sSub>
+                    <m:r>
+                      <m:t xml:space="preserve"> </m:t>
+                    </m:r>
+                  </m:e>
+                  <m:e>
+                    <m:sSub>
+                      <m:e>
+                        <m:r>
+                          <m:t xml:space="preserve"> a</m:t>
+                        </m:r>
+                      </m:e>
+                      <m:sub>
+                        <m:r>
+                          <m:t xml:space="preserve">12</m:t>
+                        </m:r>
+                      </m:sub>
+                    </m:sSub>
+                    <m:r>
+                      <m:t xml:space="preserve"> </m:t>
+                    </m:r>
+                  </m:e>
+                  <m:e>
+                    <m:sSub>
+                      <m:e>
+                        <m:r>
+                          <m:t xml:space="preserve"> a</m:t>
+                        </m:r>
+                      </m:e>
+                      <m:sub>
+                        <m:r>
+                          <m:t xml:space="preserve">13</m:t>
+                        </m:r>
+                      </m:sub>
+                    </m:sSub>
+                    <m:r>
+                      <m:t xml:space="preserve"> </m:t>
+                    </m:r>
+                  </m:e>
+                </m:mr>
+                <m:mr>
+                  <m:e>
+                    <m:sSub>
+                      <m:e>
+                        <m:r>
+                          <m:t xml:space="preserve"> a</m:t>
+                        </m:r>
+                      </m:e>
+                      <m:sub>
+                        <m:r>
+                          <m:t xml:space="preserve">21</m:t>
+                        </m:r>
+                      </m:sub>
+                    </m:sSub>
+                    <m:r>
+                      <m:t xml:space="preserve"> </m:t>
+                    </m:r>
+                  </m:e>
+                  <m:e>
+                    <m:sSub>
+                      <m:e>
+                        <m:r>
+                          <m:t xml:space="preserve"> a</m:t>
+                        </m:r>
+                      </m:e>
+                      <m:sub>
+                        <m:r>
+                          <m:t xml:space="preserve">22</m:t>
+                        </m:r>
+                      </m:sub>
+                    </m:sSub>
+                    <m:r>
+                      <m:t xml:space="preserve"> </m:t>
+                    </m:r>
+                  </m:e>
+                  <m:e>
+                    <m:sSub>
+                      <m:e>
+                        <m:r>
+                          <m:t xml:space="preserve"> a</m:t>
+                        </m:r>
+                      </m:e>
+                      <m:sub>
+                        <m:r>
+                          <m:t xml:space="preserve">23</m:t>
+                        </m:r>
+                      </m:sub>
+                    </m:sSub>
+                    <m:r>
+                      <m:t xml:space="preserve"> </m:t>
+                    </m:r>
+                  </m:e>
+                </m:mr>
+                <m:mr>
+                  <m:e>
+                    <m:sSub>
+                      <m:e>
+                        <m:r>
+                          <m:t xml:space="preserve"> a</m:t>
+                        </m:r>
+                      </m:e>
+                      <m:sub>
+                        <m:r>
+                          <m:t xml:space="preserve">31</m:t>
+                        </m:r>
+                      </m:sub>
+                    </m:sSub>
+                    <m:r>
+                      <m:t xml:space="preserve"> </m:t>
+                    </m:r>
+                  </m:e>
+                  <m:e>
+                    <m:sSub>
+                      <m:e>
+                        <m:r>
+                          <m:t xml:space="preserve"> a</m:t>
+                        </m:r>
+                      </m:e>
+                      <m:sub>
+                        <m:r>
+                          <m:t xml:space="preserve">32</m:t>
+                        </m:r>
+                      </m:sub>
+                    </m:sSub>
+                    <m:r>
+                      <m:t xml:space="preserve"> </m:t>
+                    </m:r>
+                  </m:e>
+                  <m:e>
+                    <m:sSub>
+                      <m:e>
+                        <m:r>
+                          <m:t xml:space="preserve"> a</m:t>
+                        </m:r>
+                      </m:e>
+                      <m:sub>
+                        <m:r>
+                          <m:t xml:space="preserve">33</m:t>
+                        </m:r>
+                      </m:sub>
+                    </m:sSub>
+                    <m:r>
+                      <m:t xml:space="preserve"> </m:t>
+                    </m:r>
+                  </m:e>
+                </m:mr>
+              </m:m>
+            </m:e>
+          </m:d>
+        </m:oMath>
+      </m:oMathPara>
+    </w:p>
+    <w:p>
+      <w:pPr/>
+      <w:r>
+        <w:rPr/>
+        <w:t xml:space="preserve">32. Determinant (vmatrix):</w:t>
+      </w:r>
+    </w:p>
+    <w:p>
+      <m:oMathPara>
+        <m:oMath>
+          <m:r>
+            <m:rPr>
+              <m:nor/>
+            </m:rPr>
+            <m:t xml:space="preserve">det</m:t>
+          </m:r>
+          <m:r>
+            <m:t xml:space="preserve">(A) = </m:t>
+          </m:r>
+          <m:d>
+            <m:dPr>
+              <m:begChr m:val="|"/>
+              <m:endChr m:val="|"/>
+            </m:dPr>
+            <m:e>
+              <m:m>
+                <m:mPr/>
+                <m:mr>
+                  <m:e>
+                    <m:r>
+                      <m:t xml:space="preserve"> a </m:t>
+                    </m:r>
+                  </m:e>
+                  <m:e>
+                    <m:r>
+                      <m:t xml:space="preserve"> b </m:t>
+                    </m:r>
+                  </m:e>
+                </m:mr>
+                <m:mr>
+                  <m:e>
+                    <m:r>
+                      <m:t xml:space="preserve"> c </m:t>
+                    </m:r>
+                  </m:e>
+                  <m:e>
+                    <m:r>
+                      <m:t xml:space="preserve"> d </m:t>
+                    </m:r>
+                  </m:e>
+                </m:mr>
+              </m:m>
+            </m:e>
+          </m:d>
+          <m:r>
+            <m:t xml:space="preserve"> = ad - bc</m:t>
+          </m:r>
+        </m:oMath>
+      </m:oMathPara>
+    </w:p>
+    <w:p>
+      <w:pPr/>
+      <w:r>
+        <w:rPr/>
+        <w:t xml:space="preserve">33. Bracketed Matrix (bmatrix):</w:t>
+      </w:r>
+    </w:p>
+    <w:p>
+      <m:oMathPara>
+        <m:oMath>
+          <m:sSub>
+            <m:e>
+              <m:r>
+                <m:t xml:space="preserve">I</m:t>
+              </m:r>
+            </m:e>
+            <m:sub>
+              <m:r>
+                <m:t xml:space="preserve">3</m:t>
+              </m:r>
+            </m:sub>
+          </m:sSub>
+          <m:r>
+            <m:t xml:space="preserve"> = </m:t>
+          </m:r>
+          <m:d>
+            <m:dPr>
+              <m:begChr m:val="["/>
+              <m:endChr m:val="]"/>
+            </m:dPr>
+            <m:e>
+              <m:m>
+                <m:mPr/>
+                <m:mr>
+                  <m:e>
+                    <m:r>
+                      <m:t xml:space="preserve"> 1 </m:t>
+                    </m:r>
+                  </m:e>
+                  <m:e>
+                    <m:r>
+                      <m:t xml:space="preserve"> 0 </m:t>
+                    </m:r>
+                  </m:e>
+                  <m:e>
+                    <m:r>
+                      <m:t xml:space="preserve"> 0 </m:t>
+                    </m:r>
+                  </m:e>
+                </m:mr>
+                <m:mr>
+                  <m:e>
+                    <m:r>
+                      <m:t xml:space="preserve"> 0 </m:t>
+                    </m:r>
+                  </m:e>
+                  <m:e>
+                    <m:r>
+                      <m:t xml:space="preserve"> 1 </m:t>
+                    </m:r>
+                  </m:e>
+                  <m:e>
+                    <m:r>
+                      <m:t xml:space="preserve"> 0 </m:t>
+                    </m:r>
+                  </m:e>
+                </m:mr>
+                <m:mr>
+                  <m:e>
+                    <m:r>
+                      <m:t xml:space="preserve"> 0 </m:t>
+                    </m:r>
+                  </m:e>
+                  <m:e>
+                    <m:r>
+                      <m:t xml:space="preserve"> 0 </m:t>
+                    </m:r>
+                  </m:e>
+                  <m:e>
+                    <m:r>
+                      <m:t xml:space="preserve"> 1 </m:t>
+                    </m:r>
+                  </m:e>
+                </m:mr>
+              </m:m>
+            </m:e>
+          </m:d>
+        </m:oMath>
+      </m:oMathPara>
+    </w:p>
+    <w:p>
+      <w:pPr/>
+      <w:r>
+        <w:rPr/>
+        <w:t xml:space="preserve">34. Piecewise Function (cases):</w:t>
+      </w:r>
+    </w:p>
+    <w:p>
+      <m:oMathPara>
+        <m:oMath>
+          <m:r>
+            <m:t xml:space="preserve">|x| = </m:t>
+          </m:r>
+          <m:d>
+            <m:dPr>
+              <m:begChr m:val="{"/>
+              <m:endChr m:val=""/>
+            </m:dPr>
+            <m:e>
+              <m:m>
+                <m:mPr>
+                  <m:mcs>
+                    <m:mc>
+                      <m:mcPr>
+                        <m:count m:val="1"/>
+                        <m:mcJc m:val="left"/>
+                      </m:mcPr>
+                    </m:mc>
+                    <m:mc>
+                      <m:mcPr>
+                        <m:count m:val="1"/>
+                        <m:mcJc m:val="left"/>
+                      </m:mcPr>
+                    </m:mc>
+                  </m:mcs>
+                </m:mPr>
+                <m:mr>
+                  <m:e>
+                    <m:r>
+                      <m:t xml:space="preserve"> x, </m:t>
+                    </m:r>
+                  </m:e>
+                  <m:e>
+                    <m:r>
+                      <m:t xml:space="preserve"> x </m:t>
+                    </m:r>
+                    <m:r>
+                      <m:t xml:space="preserve">≥</m:t>
+                    </m:r>
+                    <m:r>
+                      <m:t xml:space="preserve"> 0 </m:t>
+                    </m:r>
+                  </m:e>
+                </m:mr>
+                <m:mr>
+                  <m:e>
+                    <m:r>
+                      <m:t xml:space="preserve"> -x, </m:t>
+                    </m:r>
+                  </m:e>
+                  <m:e>
+                    <m:r>
+                      <m:t xml:space="preserve"> x &lt; 0 </m:t>
+                    </m:r>
+                  </m:e>
+                </m:mr>
+              </m:m>
+            </m:e>
+          </m:d>
+        </m:oMath>
+      </m:oMathPara>
+    </w:p>
+    <w:p>
+      <w:pPr/>
+      <w:r>
+        <w:rPr/>
+        <w:t xml:space="preserve">35. Auto-sized Delimiters (various brackets):</w:t>
+      </w:r>
+    </w:p>
+    <w:p>
+      <m:oMathPara>
+        <m:oMath>
+          <m:d>
+            <m:dPr>
+              <m:begChr m:val="["/>
+              <m:endChr m:val="]"/>
+            </m:dPr>
+            <m:e>
+              <m:r>
+                <m:t xml:space="preserve"> </m:t>
+              </m:r>
+              <m:f>
+                <m:num>
+                  <m:r>
+                    <m:t xml:space="preserve">a</m:t>
+                  </m:r>
+                </m:num>
+                <m:den>
+                  <m:r>
+                    <m:t xml:space="preserve">b</m:t>
+                  </m:r>
+                </m:den>
+              </m:f>
+              <m:r>
+                <m:t xml:space="preserve"> </m:t>
+              </m:r>
+            </m:e>
+          </m:d>
+          <m:r>
+            <m:t xml:space="preserve"> + </m:t>
+          </m:r>
+          <m:d>
+            <m:dPr>
+              <m:begChr m:val="{"/>
+              <m:endChr m:val="}"/>
+            </m:dPr>
+            <m:e>
+              <m:r>
+                <m:t xml:space="preserve"> </m:t>
+              </m:r>
+              <m:f>
+                <m:num>
+                  <m:r>
+                    <m:t xml:space="preserve">c</m:t>
+                  </m:r>
+                </m:num>
+                <m:den>
+                  <m:r>
+                    <m:t xml:space="preserve">d</m:t>
+                  </m:r>
+                </m:den>
+              </m:f>
+              <m:r>
+                <m:t xml:space="preserve"> </m:t>
+              </m:r>
+            </m:e>
+          </m:d>
+          <m:r>
+            <m:t xml:space="preserve"> + </m:t>
+          </m:r>
+          <m:d>
+            <m:dPr>
+              <m:begChr m:val="|"/>
+              <m:endChr m:val="|"/>
+            </m:dPr>
+            <m:e>
+              <m:r>
+                <m:t xml:space="preserve"> </m:t>
+              </m:r>
+              <m:f>
+                <m:num>
+                  <m:r>
+                    <m:t xml:space="preserve">e</m:t>
+                  </m:r>
+                </m:num>
+                <m:den>
+                  <m:r>
+                    <m:t xml:space="preserve">f</m:t>
+                  </m:r>
+                </m:den>
+              </m:f>
+              <m:r>
+                <m:t xml:space="preserve"> </m:t>
+              </m:r>
+            </m:e>
+          </m:d>
+          <m:r>
+            <m:t xml:space="preserve"> + </m:t>
+          </m:r>
+          <m:d>
+            <m:dPr>
+              <m:begChr m:val="⟨"/>
+              <m:endChr m:val="⟩"/>
+            </m:dPr>
+            <m:e>
+              <m:r>
+                <m:t xml:space="preserve"> </m:t>
+              </m:r>
+              <m:f>
+                <m:num>
+                  <m:r>
+                    <m:t xml:space="preserve">g</m:t>
+                  </m:r>
+                </m:num>
+                <m:den>
+                  <m:r>
+                    <m:t xml:space="preserve">h</m:t>
+                  </m:r>
+                </m:den>
+              </m:f>
+              <m:r>
+                <m:t xml:space="preserve"> </m:t>
+              </m:r>
+            </m:e>
+          </m:d>
+        </m:oMath>
+      </m:oMathPara>
+    </w:p>
+    <w:p>
+      <w:pPr/>
+      <w:r>
+        <w:rPr/>
+        <w:t xml:space="preserve">36. Floor and Ceiling:</w:t>
+      </w:r>
+    </w:p>
+    <w:p>
+      <m:oMathPara>
+        <m:oMath>
+          <m:d>
+            <m:dPr>
+              <m:begChr m:val="⌊"/>
+              <m:endChr m:val="⌋"/>
+            </m:dPr>
+            <m:e>
+              <m:r>
+                <m:t xml:space="preserve"> </m:t>
+              </m:r>
+              <m:f>
+                <m:num>
+                  <m:r>
+                    <m:t xml:space="preserve">n</m:t>
+                  </m:r>
+                </m:num>
+                <m:den>
+                  <m:r>
+                    <m:t xml:space="preserve">2</m:t>
+                  </m:r>
+                </m:den>
+              </m:f>
+              <m:r>
+                <m:t xml:space="preserve"> </m:t>
+              </m:r>
+            </m:e>
+          </m:d>
+          <m:r>
+            <m:t xml:space="preserve"> + </m:t>
+          </m:r>
+          <m:d>
+            <m:dPr>
+              <m:begChr m:val="⌈"/>
+              <m:endChr m:val="⌉"/>
+            </m:dPr>
+            <m:e>
+              <m:r>
+                <m:t xml:space="preserve"> </m:t>
+              </m:r>
+              <m:f>
+                <m:num>
+                  <m:r>
+                    <m:t xml:space="preserve">n</m:t>
+                  </m:r>
+                </m:num>
+                <m:den>
+                  <m:r>
+                    <m:t xml:space="preserve">2</m:t>
+                  </m:r>
+                </m:den>
+              </m:f>
+              <m:r>
+                <m:t xml:space="preserve"> </m:t>
+              </m:r>
+            </m:e>
+          </m:d>
+          <m:r>
+            <m:t xml:space="preserve"> = n</m:t>
+          </m:r>
+        </m:oMath>
+      </m:oMathPara>
+    </w:p>
+    <w:p>
+      <w:pPr/>
+      <w:r>
+        <w:rPr/>
+        <w:t xml:space="preserve">37. Underbrace and Overbrace:</w:t>
+      </w:r>
+    </w:p>
+    <w:p>
+      <m:oMathPara>
+        <m:oMath>
+          <m:limLow>
+            <m:limLowPr/>
+            <m:e>
+              <m:groupChr>
+                <m:groupChrPr>
+                  <m:chr m:val="⏟"/>
+                  <m:pos m:val="bot"/>
+                </m:groupChrPr>
+                <m:e>
+                  <m:r>
+                    <m:t xml:space="preserve">1 + 2 + </m:t>
+                  </m:r>
+                  <m:r>
+                    <m:t xml:space="preserve">⋯</m:t>
+                  </m:r>
+                  <m:r>
+                    <m:t xml:space="preserve"> + n</m:t>
+                  </m:r>
+                </m:e>
+              </m:groupChr>
+            </m:e>
+            <m:lim>
+              <m:r>
+                <m:t xml:space="preserve">n </m:t>
+              </m:r>
+              <m:r>
+                <m:rPr>
+                  <m:nor/>
+                </m:rPr>
+                <m:t xml:space="preserve"> terms</m:t>
+              </m:r>
+            </m:lim>
+          </m:limLow>
+          <m:r>
+            <m:t xml:space="preserve"> = </m:t>
+          </m:r>
+          <m:limUpp>
+            <m:limUppPr/>
+            <m:e>
+              <m:groupChr>
+                <m:groupChrPr>
+                  <m:chr m:val="⏞"/>
+                  <m:pos m:val="top"/>
+                </m:groupChrPr>
+                <m:e>
+                  <m:f>
+                    <m:num>
+                      <m:r>
+                        <m:t xml:space="preserve">n(n+1)</m:t>
+                      </m:r>
+                    </m:num>
+                    <m:den>
+                      <m:r>
+                        <m:t xml:space="preserve">2</m:t>
+                      </m:r>
+                    </m:den>
+                  </m:f>
+                </m:e>
+              </m:groupChr>
+            </m:e>
+            <m:lim>
+              <m:r>
+                <m:rPr>
+                  <m:nor/>
+                </m:rPr>
+                <m:t xml:space="preserve">closed form</m:t>
+              </m:r>
+            </m:lim>
+          </m:limUpp>
+        </m:oMath>
+      </m:oMathPara>
+    </w:p>
+    <w:p>
+      <w:pPr/>
+      <w:r>
+        <w:rPr/>
+        <w:t xml:space="preserve">38. Overset (definition):</w:t>
+      </w:r>
+    </w:p>
+    <w:p>
+      <m:oMathPara>
+        <m:oMath>
+          <m:r>
+            <m:t xml:space="preserve">f(x) </m:t>
+          </m:r>
+          <m:limUpp>
+            <m:limUppPr/>
+            <m:e>
+              <m:r>
+                <m:t xml:space="preserve">=</m:t>
+              </m:r>
+            </m:e>
+            <m:lim>
+              <m:r>
+                <m:rPr>
+                  <m:nor/>
+                </m:rPr>
+                <m:t xml:space="preserve">def</m:t>
+              </m:r>
+            </m:lim>
+          </m:limUpp>
+          <m:r>
+            <m:t xml:space="preserve"> </m:t>
+          </m:r>
+          <m:limLow>
+            <m:limLowPr/>
+            <m:e>
+              <m:r>
+                <m:rPr>
+                  <m:nor/>
+                </m:rPr>
+                <m:t xml:space="preserve">lim</m:t>
+              </m:r>
+            </m:e>
+            <m:lim>
+              <m:r>
+                <m:t xml:space="preserve">h </m:t>
+              </m:r>
+              <m:r>
+                <m:t xml:space="preserve">→</m:t>
+              </m:r>
+              <m:r>
+                <m:t xml:space="preserve"> 0</m:t>
+              </m:r>
+            </m:lim>
+          </m:limLow>
+          <m:r>
+            <m:t xml:space="preserve"> </m:t>
+          </m:r>
+          <m:f>
+            <m:num>
+              <m:r>
+                <m:t xml:space="preserve">f(x+h) - f(x)</m:t>
+              </m:r>
+            </m:num>
+            <m:den>
+              <m:r>
+                <m:t xml:space="preserve">h</m:t>
+              </m:r>
+            </m:den>
+          </m:f>
+        </m:oMath>
+      </m:oMathPara>
+    </w:p>
+    <w:p>
+      <w:pPr/>
+      <w:r>
+        <w:rPr/>
+        <w:t xml:space="preserve">39. Math Fonts (mathbb / mathcal / mathbf / mathrm):</w:t>
+      </w:r>
+    </w:p>
+    <w:p>
+      <m:oMathPara>
+        <m:oMath>
+          <m:r>
+            <m:t xml:space="preserve">∀</m:t>
+          </m:r>
+          <m:r>
+            <m:t xml:space="preserve"> x </m:t>
+          </m:r>
+          <m:r>
+            <m:t xml:space="preserve">∈</m:t>
+          </m:r>
+          <m:r>
+            <m:t xml:space="preserve"> </m:t>
+          </m:r>
+          <m:r>
+            <m:rPr>
+              <m:scr m:val="double-struck"/>
+              <m:sty m:val="p"/>
+            </m:rPr>
+            <m:t xml:space="preserve">R</m:t>
+          </m:r>
+          <m:r>
+            <m:t xml:space="preserve">, </m:t>
+          </m:r>
+          <m:r>
+            <m:t xml:space="preserve">∃</m:t>
+          </m:r>
+          <m:r>
+            <m:t xml:space="preserve"> </m:t>
+          </m:r>
+          <m:r>
+            <m:rPr>
+              <m:scr m:val="script"/>
+              <m:sty m:val="p"/>
+            </m:rPr>
+            <m:t xml:space="preserve">L</m:t>
+          </m:r>
+          <m:r>
+            <m:t xml:space="preserve"> : </m:t>
+          </m:r>
+          <m:r>
+            <m:rPr>
+              <m:sty m:val="b"/>
+            </m:rPr>
+            <m:t xml:space="preserve">v</m:t>
+          </m:r>
+          <m:r>
+            <m:t xml:space="preserve"> </m:t>
+          </m:r>
+          <m:r>
+            <m:t xml:space="preserve">↦</m:t>
+          </m:r>
+          <m:r>
+            <m:t xml:space="preserve"> </m:t>
+          </m:r>
+          <m:r>
+            <m:rPr>
+              <m:sty m:val="p"/>
+            </m:rPr>
+            <m:t xml:space="preserve">d</m:t>
+          </m:r>
+          <m:r>
+            <m:rPr>
+              <m:sty m:val="b"/>
+            </m:rPr>
+            <m:t xml:space="preserve">v</m:t>
+          </m:r>
+        </m:oMath>
+      </m:oMathPara>
+    </w:p>
+    <w:p>
+      <w:pPr/>
+      <w:r>
+        <w:rPr/>
+        <w:t xml:space="preserve">40. Cancellation:</w:t>
+      </w:r>
+    </w:p>
+    <w:p>
+      <m:oMathPara>
+        <m:oMath>
+          <m:f>
+            <m:num>
+              <m:r>
+                <m:t xml:space="preserve">(x+1) </m:t>
+              </m:r>
+              <m:borderBox>
+                <m:borderBoxPr>
+                  <m:hideTop m:val="true"/>
+                  <m:hideBot m:val="true"/>
+                  <m:hideLeft m:val="true"/>
+                  <m:hideRight m:val="true"/>
+                  <m:strikeTLBR m:val="true"/>
+                </m:borderBoxPr>
+                <m:e>
+                  <m:r>
+                    <m:t xml:space="preserve">(x-1)</m:t>
+                  </m:r>
+                </m:e>
+              </m:borderBox>
+            </m:num>
+            <m:den>
+              <m:borderBox>
+                <m:borderBoxPr>
+                  <m:hideTop m:val="true"/>
+                  <m:hideBot m:val="true"/>
+                  <m:hideLeft m:val="true"/>
+                  <m:hideRight m:val="true"/>
+                  <m:strikeTLBR m:val="true"/>
+                </m:borderBoxPr>
+                <m:e>
+                  <m:r>
+                    <m:t xml:space="preserve">(x-1)</m:t>
+                  </m:r>
+                </m:e>
+              </m:borderBox>
+            </m:den>
+          </m:f>
+          <m:r>
+            <m:t xml:space="preserve"> = x + 1</m:t>
+          </m:r>
+        </m:oMath>
+      </m:oMathPara>
+    </w:p>
+    <w:p>
+      <w:pPr/>
+      <w:r>
+        <w:rPr/>
+        <w:t xml:space="preserve">41. Cancel-to (limit):</w:t>
+      </w:r>
+    </w:p>
+    <w:p>
+      <m:oMathPara>
+        <m:oMath>
+          <m:limLow>
+            <m:limLowPr/>
+            <m:e>
+              <m:r>
+                <m:rPr>
+                  <m:nor/>
+                </m:rPr>
+                <m:t xml:space="preserve">lim</m:t>
+              </m:r>
+            </m:e>
+            <m:lim>
+              <m:r>
+                <m:t xml:space="preserve">x </m:t>
+              </m:r>
+              <m:r>
+                <m:t xml:space="preserve">→</m:t>
+              </m:r>
+              <m:r>
+                <m:t xml:space="preserve"> </m:t>
+              </m:r>
+              <m:r>
+                <m:t xml:space="preserve">∞</m:t>
+              </m:r>
+            </m:lim>
+          </m:limLow>
+          <m:r>
+            <m:t xml:space="preserve"> </m:t>
+          </m:r>
+          <m:borderBox>
+            <m:borderBoxPr>
+              <m:hideTop m:val="true"/>
+              <m:hideBot m:val="true"/>
+              <m:hideLeft m:val="true"/>
+              <m:hideRight m:val="true"/>
+              <m:strikeTLBR m:val="true"/>
+            </m:borderBoxPr>
+            <m:e>
+              <m:f>
+                <m:num>
+                  <m:r>
+                    <m:t xml:space="preserve">1</m:t>
+                  </m:r>
+                </m:num>
+                <m:den>
+                  <m:r>
+                    <m:t xml:space="preserve">x</m:t>
+                  </m:r>
+                </m:den>
+              </m:f>
+            </m:e>
+          </m:borderBox>
+          <m:r>
+            <m:t xml:space="preserve"> + 1 = 1</m:t>
+          </m:r>
+        </m:oMath>
+      </m:oMathPara>
+    </w:p>
+    <w:p>
+      <w:pPr/>
+      <w:r>
+        <w:rPr/>
+        <w:t xml:space="preserve">42. Boxed Result:</w:t>
+      </w:r>
+    </w:p>
+    <w:p>
+      <m:oMathPara>
+        <m:oMath>
+          <m:borderBox>
+            <m:borderBoxPr/>
+            <m:e>
+              <m:sSup>
+                <m:e>
+                  <m:r>
+                    <m:t xml:space="preserve">E = mc</m:t>
+                  </m:r>
+                </m:e>
+                <m:sup>
+                  <m:r>
+                    <m:t xml:space="preserve">2</m:t>
+                  </m:r>
+                </m:sup>
+              </m:sSup>
+            </m:e>
+          </m:borderBox>
+        </m:oMath>
+      </m:oMathPara>
+    </w:p>
+    <w:p>
+      <w:pPr/>
+      <w:r>
+        <w:rPr/>
+        <w:t xml:space="preserve">43. Accents (bar / vec / tilde / ddot):</w:t>
+      </w:r>
+    </w:p>
+    <w:p>
+      <m:oMathPara>
+        <m:oMath>
+          <m:acc>
+            <m:accPr>
+              <m:chr m:val="̄"/>
+            </m:accPr>
+            <m:e>
+              <m:r>
+                <m:t xml:space="preserve">x</m:t>
+              </m:r>
+            </m:e>
+          </m:acc>
+          <m:r>
+            <m:t xml:space="preserve"> = </m:t>
+          </m:r>
+          <m:f>
+            <m:num>
+              <m:r>
+                <m:t xml:space="preserve">1</m:t>
+              </m:r>
+            </m:num>
+            <m:den>
+              <m:r>
+                <m:t xml:space="preserve">n</m:t>
+              </m:r>
+            </m:den>
+          </m:f>
+          <m:r>
+            <m:t xml:space="preserve"> </m:t>
+          </m:r>
+          <m:sSub>
+            <m:e>
+              <m:nary>
+                <m:naryPr>
+                  <m:chr m:val="∑"/>
+                  <m:subHide m:val="true"/>
+                  <m:supHide m:val="true"/>
+                </m:naryPr>
+                <m:sub/>
+                <m:sup/>
+                <m:e>
+                  <m:r>
+                    <m:t xml:space="preserve">x</m:t>
+                  </m:r>
+                </m:e>
+              </m:nary>
+            </m:e>
+            <m:sub>
+              <m:r>
+                <m:t xml:space="preserve">i</m:t>
+              </m:r>
+            </m:sub>
+          </m:sSub>
+          <m:r>
+            <m:t xml:space="preserve">, </m:t>
+          </m:r>
+          <m:r>
+            <m:t xml:space="preserve"> </m:t>
+          </m:r>
+          <m:r>
+            <m:t xml:space="preserve"> </m:t>
+          </m:r>
+          <m:acc>
+            <m:accPr>
+              <m:chr m:val="⃗"/>
+            </m:accPr>
+            <m:e>
+              <m:r>
+                <m:t xml:space="preserve">F</m:t>
+              </m:r>
+            </m:e>
+          </m:acc>
+          <m:r>
+            <m:t xml:space="preserve"> = m</m:t>
+          </m:r>
+          <m:acc>
+            <m:accPr>
+              <m:chr m:val="̈"/>
+            </m:accPr>
+            <m:e>
+              <m:acc>
+                <m:accPr>
+                  <m:chr m:val="⃗"/>
+                </m:accPr>
+                <m:e>
+                  <m:r>
+                    <m:t xml:space="preserve">r</m:t>
+                  </m:r>
+                </m:e>
+              </m:acc>
+            </m:e>
+          </m:acc>
+          <m:r>
+            <m:t xml:space="preserve">, </m:t>
+          </m:r>
+          <m:r>
+            <m:t xml:space="preserve"> </m:t>
+          </m:r>
+          <m:r>
+            <m:t xml:space="preserve"> </m:t>
+          </m:r>
+          <m:acc>
+            <m:accPr>
+              <m:chr m:val="̃"/>
+            </m:accPr>
+            <m:e>
+              <m:r>
+                <m:t xml:space="preserve">f</m:t>
+              </m:r>
+            </m:e>
+          </m:acc>
+          <m:r>
+            <m:t xml:space="preserve">(</m:t>
+          </m:r>
+          <m:r>
+            <m:t xml:space="preserve">ξ</m:t>
+          </m:r>
+          <m:r>
+            <m:t xml:space="preserve">)</m:t>
+          </m:r>
+        </m:oMath>
+      </m:oMathPara>
+    </w:p>
+    <w:p>
+      <w:pPr/>
+      <w:r>
+        <w:rPr/>
+        <w:t xml:space="preserve">44. Overline and Underline:</w:t>
+      </w:r>
+    </w:p>
+    <w:p>
+      <m:oMathPara>
+        <m:oMath>
+          <m:bar>
+            <m:barPr>
+              <m:pos m:val="top"/>
+            </m:barPr>
+            <m:e>
+              <m:r>
+                <m:t xml:space="preserve">A </m:t>
+              </m:r>
+              <m:r>
+                <m:t xml:space="preserve">∪</m:t>
+              </m:r>
+              <m:r>
+                <m:t xml:space="preserve"> B</m:t>
+              </m:r>
+            </m:e>
+          </m:bar>
+          <m:r>
+            <m:t xml:space="preserve"> = </m:t>
+          </m:r>
+          <m:bar>
+            <m:barPr>
+              <m:pos m:val="top"/>
+            </m:barPr>
+            <m:e>
+              <m:r>
+                <m:t xml:space="preserve">A</m:t>
+              </m:r>
+            </m:e>
+          </m:bar>
+          <m:r>
+            <m:t xml:space="preserve"> </m:t>
+          </m:r>
+          <m:r>
+            <m:t xml:space="preserve">∩</m:t>
+          </m:r>
+          <m:r>
+            <m:t xml:space="preserve"> </m:t>
+          </m:r>
+          <m:bar>
+            <m:barPr>
+              <m:pos m:val="top"/>
+            </m:barPr>
+            <m:e>
+              <m:r>
+                <m:t xml:space="preserve">B</m:t>
+              </m:r>
+            </m:e>
+          </m:bar>
+          <m:r>
+            <m:t xml:space="preserve">, </m:t>
+          </m:r>
+          <m:r>
+            <m:t xml:space="preserve"> </m:t>
+          </m:r>
+          <m:r>
+            <m:t xml:space="preserve"> </m:t>
+          </m:r>
+          <m:bar>
+            <m:barPr>
+              <m:pos m:val="bot"/>
+            </m:barPr>
+            <m:e>
+              <m:r>
+                <m:t xml:space="preserve">x</m:t>
+              </m:r>
+            </m:e>
+          </m:bar>
+          <m:r>
+            <m:t xml:space="preserve"> </m:t>
+          </m:r>
+          <m:r>
+            <m:t xml:space="preserve">≤</m:t>
+          </m:r>
+          <m:r>
+            <m:t xml:space="preserve"> x </m:t>
+          </m:r>
+          <m:r>
+            <m:t xml:space="preserve">≤</m:t>
+          </m:r>
+          <m:r>
+            <m:t xml:space="preserve"> </m:t>
+          </m:r>
+          <m:bar>
+            <m:barPr>
+              <m:pos m:val="top"/>
+            </m:barPr>
+            <m:e>
+              <m:r>
+                <m:t xml:space="preserve">x</m:t>
+              </m:r>
+            </m:e>
+          </m:bar>
+        </m:oMath>
+      </m:oMathPara>
+    </w:p>
+    <w:p>
+      <w:pPr/>
+      <w:r>
+        <w:rPr/>
+        <w:t xml:space="preserve">45. Hyperbolic and Inverse Trig:</w:t>
+      </w:r>
+    </w:p>
+    <w:p>
+      <m:oMathPara>
+        <m:oMath>
+          <m:r>
+            <m:rPr>
+              <m:nor/>
+            </m:rPr>
+            <m:t xml:space="preserve">arctan</m:t>
+          </m:r>
+          <m:r>
+            <m:t xml:space="preserve">(x) = </m:t>
+          </m:r>
+          <m:nary>
+            <m:naryPr>
+              <m:chr m:val="∫"/>
+            </m:naryPr>
+            <m:sub>
+              <m:r>
+                <m:t xml:space="preserve">0</m:t>
+              </m:r>
+            </m:sub>
+            <m:sup>
+              <m:r>
+                <m:t xml:space="preserve">x</m:t>
+              </m:r>
+            </m:sup>
+            <m:e>
+              <m:r>
+                <m:t xml:space="preserve"/>
+              </m:r>
+            </m:e>
+          </m:nary>
+          <m:f>
+            <m:num>
+              <m:r>
+                <m:t xml:space="preserve">dt</m:t>
+              </m:r>
+            </m:num>
+            <m:den>
+              <m:sSup>
+                <m:e>
+                  <m:r>
+                    <m:t xml:space="preserve">1+t</m:t>
+                  </m:r>
+                </m:e>
+                <m:sup>
+                  <m:r>
+                    <m:t xml:space="preserve">2</m:t>
+                  </m:r>
+                </m:sup>
+              </m:sSup>
+            </m:den>
+          </m:f>
+          <m:r>
+            <m:t xml:space="preserve">, </m:t>
+          </m:r>
+          <m:r>
+            <m:t xml:space="preserve"> </m:t>
+          </m:r>
+          <m:r>
+            <m:t xml:space="preserve"> </m:t>
+          </m:r>
+          <m:sSup>
+            <m:e>
+              <m:r>
+                <m:rPr>
+                  <m:nor/>
+                </m:rPr>
+                <m:t xml:space="preserve">cosh</m:t>
+              </m:r>
+            </m:e>
+            <m:sup>
+              <m:r>
+                <m:t xml:space="preserve">2</m:t>
+              </m:r>
+            </m:sup>
+          </m:sSup>
+          <m:r>
+            <m:t xml:space="preserve">(x) - </m:t>
+          </m:r>
+          <m:sSup>
+            <m:e>
+              <m:r>
+                <m:rPr>
+                  <m:nor/>
+                </m:rPr>
+                <m:t xml:space="preserve">sinh</m:t>
+              </m:r>
+            </m:e>
+            <m:sup>
+              <m:r>
+                <m:t xml:space="preserve">2</m:t>
+              </m:r>
+            </m:sup>
+          </m:sSup>
+          <m:r>
+            <m:t xml:space="preserve">(x) = 1</m:t>
+          </m:r>
+        </m:oMath>
+      </m:oMathPara>
+    </w:p>
+    <w:p>
+      <w:pPr/>
+      <w:r>
+        <w:rPr/>
+        <w:t xml:space="preserve">46. Custom Operator (operatorname):</w:t>
+      </w:r>
+    </w:p>
+    <w:p>
+      <m:oMathPara>
+        <m:oMath>
+          <m:r>
+            <m:rPr>
+              <m:nor/>
+            </m:rPr>
+            <m:t xml:space="preserve">lcm</m:t>
+          </m:r>
+          <m:r>
+            <m:t xml:space="preserve">(a, b) </m:t>
+          </m:r>
+          <m:r>
+            <m:t xml:space="preserve">·</m:t>
+          </m:r>
+          <m:r>
+            <m:t xml:space="preserve"> </m:t>
+          </m:r>
+          <m:r>
+            <m:rPr>
+              <m:nor/>
+            </m:rPr>
+            <m:t xml:space="preserve">gcd</m:t>
+          </m:r>
+          <m:r>
+            <m:t xml:space="preserve">(a, b) = |ab|</m:t>
+          </m:r>
+        </m:oMath>
+      </m:oMathPara>
+    </w:p>
+    <w:p>
+      <w:pPr/>
+      <w:r>
+        <w:rPr/>
+        <w:t xml:space="preserve">47. Modular Arithmetic:</w:t>
+      </w:r>
+    </w:p>
+    <w:p>
+      <m:oMathPara>
+        <m:oMath>
+          <m:r>
+            <m:t xml:space="preserve">a </m:t>
+          </m:r>
+          <m:r>
+            <m:t xml:space="preserve">≡</m:t>
+          </m:r>
+          <m:r>
+            <m:t xml:space="preserve"> b </m:t>
+          </m:r>
+          <m:d>
+            <m:dPr/>
+            <m:e>
+              <m:r>
+                <m:rPr>
+                  <m:nor/>
+                </m:rPr>
+                <m:t xml:space="preserve">mod</m:t>
+              </m:r>
+              <m:r>
+                <m:t xml:space="preserve"> </m:t>
+              </m:r>
+              <m:r>
+                <m:t xml:space="preserve">n</m:t>
+              </m:r>
+            </m:e>
+          </m:d>
+          <m:r>
+            <m:t xml:space="preserve"> </m:t>
+          </m:r>
+          <m:r>
+            <m:t xml:space="preserve">⟺</m:t>
+          </m:r>
+          <m:r>
+            <m:t xml:space="preserve"> n </m:t>
+          </m:r>
+          <m:r>
+            <m:t xml:space="preserve">∣</m:t>
+          </m:r>
+          <m:r>
+            <m:t xml:space="preserve"> (a - b), </m:t>
+          </m:r>
+          <m:r>
+            <m:t xml:space="preserve"> </m:t>
+          </m:r>
+          <m:r>
+            <m:t xml:space="preserve"> 17 </m:t>
+          </m:r>
+          <m:r>
+            <m:rPr>
+              <m:nor/>
+            </m:rPr>
+            <m:t xml:space="preserve"> mod </m:t>
+          </m:r>
+          <m:r>
+            <m:t xml:space="preserve"> 5 = 2</m:t>
+          </m:r>
+        </m:oMath>
+      </m:oMathPara>
+    </w:p>
+    <w:p>
+      <w:pPr/>
+      <w:r>
+        <w:rPr/>
+        <w:t xml:space="preserve">48. Double Integral with Text:</w:t>
+      </w:r>
+    </w:p>
+    <w:p>
+      <m:oMathPara>
+        <m:oMath>
+          <m:nary>
+            <m:naryPr>
+              <m:chr m:val="∬"/>
+              <m:supHide m:val="true"/>
+            </m:naryPr>
+            <m:sub>
+              <m:r>
+                <m:t xml:space="preserve">D</m:t>
+              </m:r>
+            </m:sub>
+            <m:sup/>
+            <m:e>
+              <m:r>
+                <m:t xml:space="preserve">f</m:t>
+              </m:r>
+            </m:e>
+          </m:nary>
+          <m:r>
+            <m:t xml:space="preserve">(x,y) </m:t>
+          </m:r>
+          <m:r>
+            <m:t xml:space="preserve"> </m:t>
+          </m:r>
+          <m:r>
+            <m:t xml:space="preserve"> dA </m:t>
+          </m:r>
+          <m:r>
+            <m:t xml:space="preserve"> </m:t>
+          </m:r>
+          <m:r>
+            <m:t xml:space="preserve"> </m:t>
+          </m:r>
+          <m:r>
+            <m:rPr>
+              <m:nor/>
+            </m:rPr>
+            <m:t xml:space="preserve">where </m:t>
+          </m:r>
+          <m:r>
+            <m:t xml:space="preserve"> D = </m:t>
+          </m:r>
+          <m:r>
+            <m:t xml:space="preserve">{</m:t>
+          </m:r>
+          <m:sSup>
+            <m:e>
+              <m:r>
+                <m:t xml:space="preserve">(x,y) : x</m:t>
+              </m:r>
+            </m:e>
+            <m:sup>
+              <m:r>
+                <m:t xml:space="preserve">2</m:t>
+              </m:r>
+            </m:sup>
+          </m:sSup>
+          <m:sSup>
+            <m:e>
+              <m:r>
+                <m:t xml:space="preserve">+y</m:t>
+              </m:r>
+            </m:e>
+            <m:sup>
+              <m:r>
+                <m:t xml:space="preserve">2</m:t>
+              </m:r>
+            </m:sup>
+          </m:sSup>
+          <m:r>
+            <m:t xml:space="preserve"> </m:t>
+          </m:r>
+          <m:r>
+            <m:t xml:space="preserve">≤</m:t>
+          </m:r>
+          <m:r>
+            <m:t xml:space="preserve"> 1</m:t>
+          </m:r>
+          <m:r>
+            <m:t xml:space="preserve">}</m:t>
+          </m:r>
+        </m:oMath>
+      </m:oMathPara>
+    </w:p>
+    <w:p>
+      <w:pPr/>
+      <w:r>
+        <w:rPr/>
+        <w:t xml:space="preserve">49. Big Operators (bigcup / bigcap / coprod):</w:t>
+      </w:r>
+    </w:p>
+    <w:p>
+      <m:oMathPara>
+        <m:oMath>
+          <m:sSub>
+            <m:e>
+              <m:nary>
+                <m:naryPr>
+                  <m:chr m:val="⋃"/>
+                </m:naryPr>
+                <m:sub>
+                  <m:r>
+                    <m:t xml:space="preserve">i=1</m:t>
+                  </m:r>
+                </m:sub>
+                <m:sup>
+                  <m:r>
+                    <m:t xml:space="preserve">n</m:t>
+                  </m:r>
+                </m:sup>
+                <m:e>
+                  <m:r>
+                    <m:t xml:space="preserve">A</m:t>
+                  </m:r>
+                </m:e>
+              </m:nary>
+            </m:e>
+            <m:sub>
+              <m:r>
+                <m:t xml:space="preserve">i</m:t>
+              </m:r>
+            </m:sub>
+          </m:sSub>
+          <m:r>
+            <m:t xml:space="preserve"> </m:t>
+          </m:r>
+          <m:r>
+            <m:t xml:space="preserve">⊇</m:t>
+          </m:r>
+          <m:r>
+            <m:t xml:space="preserve"> </m:t>
+          </m:r>
+          <m:sSub>
+            <m:e>
+              <m:nary>
+                <m:naryPr>
+                  <m:chr m:val="⋂"/>
+                </m:naryPr>
+                <m:sub>
+                  <m:r>
+                    <m:t xml:space="preserve">i=1</m:t>
+                  </m:r>
+                </m:sub>
+                <m:sup>
+                  <m:r>
+                    <m:t xml:space="preserve">n</m:t>
+                  </m:r>
+                </m:sup>
+                <m:e>
+                  <m:r>
+                    <m:t xml:space="preserve">A</m:t>
+                  </m:r>
+                </m:e>
+              </m:nary>
+            </m:e>
+            <m:sub>
+              <m:r>
+                <m:t xml:space="preserve">i</m:t>
+              </m:r>
+            </m:sub>
+          </m:sSub>
+          <m:r>
+            <m:t xml:space="preserve">, </m:t>
+          </m:r>
+          <m:r>
+            <m:t xml:space="preserve"> </m:t>
+          </m:r>
+          <m:r>
+            <m:t xml:space="preserve"> </m:t>
+          </m:r>
+          <m:sSub>
+            <m:e>
+              <m:nary>
+                <m:naryPr>
+                  <m:chr m:val="∐"/>
+                  <m:supHide m:val="true"/>
+                </m:naryPr>
+                <m:sub>
+                  <m:r>
+                    <m:t xml:space="preserve">i </m:t>
+                  </m:r>
+                  <m:r>
+                    <m:t xml:space="preserve">∈</m:t>
+                  </m:r>
+                  <m:r>
+                    <m:t xml:space="preserve"> I</m:t>
+                  </m:r>
+                </m:sub>
+                <m:sup/>
+                <m:e>
+                  <m:r>
+                    <m:t xml:space="preserve">X</m:t>
+                  </m:r>
+                </m:e>
+              </m:nary>
+            </m:e>
+            <m:sub>
+              <m:r>
+                <m:t xml:space="preserve">i</m:t>
+              </m:r>
+            </m:sub>
+          </m:sSub>
+        </m:oMath>
+      </m:oMathPara>
+    </w:p>
+    <w:p>
+      <w:pPr/>
+      <w:r>
+        <w:rPr/>
+        <w:t xml:space="preserve">50. Greek Letters (full uppercase set):</w:t>
+      </w:r>
+    </w:p>
+    <w:p>
+      <m:oMathPara>
+        <m:oMath>
+          <m:r>
+            <m:t xml:space="preserve">Γ</m:t>
+          </m:r>
+          <m:r>
+            <m:t xml:space="preserve">, </m:t>
+          </m:r>
+          <m:r>
+            <m:t xml:space="preserve">Θ</m:t>
+          </m:r>
+          <m:r>
+            <m:t xml:space="preserve">, </m:t>
+          </m:r>
+          <m:r>
+            <m:t xml:space="preserve">Ξ</m:t>
+          </m:r>
+          <m:r>
+            <m:t xml:space="preserve">, </m:t>
+          </m:r>
+          <m:r>
+            <m:t xml:space="preserve">Π</m:t>
+          </m:r>
+          <m:r>
+            <m:t xml:space="preserve">, </m:t>
+          </m:r>
+          <m:r>
+            <m:t xml:space="preserve">Φ</m:t>
+          </m:r>
+          <m:r>
+            <m:t xml:space="preserve">, </m:t>
+          </m:r>
+          <m:r>
+            <m:t xml:space="preserve">Ψ</m:t>
+          </m:r>
+          <m:r>
+            <m:t xml:space="preserve">, </m:t>
+          </m:r>
+          <m:r>
+            <m:t xml:space="preserve">Ω</m:t>
+          </m:r>
+          <m:r>
+            <m:t xml:space="preserve"> </m:t>
+          </m:r>
+          <m:r>
+            <m:t xml:space="preserve">∈</m:t>
+          </m:r>
+          <m:r>
+            <m:t xml:space="preserve"> </m:t>
+          </m:r>
+          <m:r>
+            <m:t xml:space="preserve">{</m:t>
+          </m:r>
+          <m:r>
+            <m:t xml:space="preserve">α</m:t>
+          </m:r>
+          <m:r>
+            <m:t xml:space="preserve">, </m:t>
+          </m:r>
+          <m:r>
+            <m:t xml:space="preserve">β</m:t>
+          </m:r>
+          <m:r>
+            <m:t xml:space="preserve">, </m:t>
+          </m:r>
+          <m:r>
+            <m:t xml:space="preserve">γ</m:t>
+          </m:r>
+          <m:r>
+            <m:t xml:space="preserve">, </m:t>
+          </m:r>
+          <m:r>
+            <m:t xml:space="preserve">δ</m:t>
+          </m:r>
+          <m:r>
+            <m:t xml:space="preserve">, </m:t>
+          </m:r>
+          <m:r>
+            <m:t xml:space="preserve">ε</m:t>
+          </m:r>
+          <m:r>
+            <m:t xml:space="preserve">, </m:t>
+          </m:r>
+          <m:r>
+            <m:t xml:space="preserve">ζ</m:t>
+          </m:r>
+          <m:r>
+            <m:t xml:space="preserve">, </m:t>
+          </m:r>
+          <m:r>
+            <m:t xml:space="preserve">η</m:t>
+          </m:r>
+          <m:r>
+            <m:t xml:space="preserve">, </m:t>
+          </m:r>
+          <m:r>
+            <m:t xml:space="preserve">θ</m:t>
+          </m:r>
+          <m:r>
+            <m:t xml:space="preserve">}</m:t>
+          </m:r>
+        </m:oMath>
+      </m:oMathPara>
+    </w:p>
+    <w:p>
+      <w:pPr/>
+      <w:r>
+        <w:rPr/>
+        <w:t xml:space="preserve">51. Dots (ldots / cdots / vdots / ddots):</w:t>
+      </w:r>
+    </w:p>
+    <w:p>
+      <m:oMathPara>
+        <m:oMath>
+          <m:r>
+            <m:t xml:space="preserve">M = </m:t>
+          </m:r>
+          <m:d>
+            <m:dPr/>
+            <m:e>
+              <m:m>
+                <m:mPr/>
+                <m:mr>
+                  <m:e>
+                    <m:sSub>
+                      <m:e>
+                        <m:r>
+                          <m:t xml:space="preserve"> a</m:t>
+                        </m:r>
+                      </m:e>
+                      <m:sub>
+                        <m:r>
+                          <m:t xml:space="preserve">11</m:t>
+                        </m:r>
+                      </m:sub>
+                    </m:sSub>
+                    <m:r>
+                      <m:t xml:space="preserve"> </m:t>
+                    </m:r>
+                  </m:e>
+                  <m:e>
+                    <m:r>
+                      <m:t xml:space="preserve"> </m:t>
+                    </m:r>
+                    <m:r>
+                      <m:t xml:space="preserve">⋯</m:t>
+                    </m:r>
+                    <m:r>
+                      <m:t xml:space="preserve"> </m:t>
+                    </m:r>
+                  </m:e>
+                  <m:e>
+                    <m:sSub>
+                      <m:e>
+                        <m:r>
+                          <m:t xml:space="preserve"> a</m:t>
+                        </m:r>
+                      </m:e>
+                      <m:sub>
+                        <m:r>
+                          <m:t xml:space="preserve">1n</m:t>
+                        </m:r>
+                      </m:sub>
+                    </m:sSub>
+                    <m:r>
+                      <m:t xml:space="preserve"> </m:t>
+                    </m:r>
+                  </m:e>
+                </m:mr>
+                <m:mr>
+                  <m:e>
+                    <m:r>
+                      <m:t xml:space="preserve"> </m:t>
+                    </m:r>
+                    <m:r>
+                      <m:t xml:space="preserve">⋮</m:t>
+                    </m:r>
+                    <m:r>
+                      <m:t xml:space="preserve"> </m:t>
+                    </m:r>
+                  </m:e>
+                  <m:e>
+                    <m:r>
+                      <m:t xml:space="preserve"> </m:t>
+                    </m:r>
+                    <m:r>
+                      <m:t xml:space="preserve">⋱</m:t>
+                    </m:r>
+                    <m:r>
+                      <m:t xml:space="preserve"> </m:t>
+                    </m:r>
+                  </m:e>
+                  <m:e>
+                    <m:r>
+                      <m:t xml:space="preserve"> </m:t>
+                    </m:r>
+                    <m:r>
+                      <m:t xml:space="preserve">⋮</m:t>
+                    </m:r>
+                    <m:r>
+                      <m:t xml:space="preserve"> </m:t>
+                    </m:r>
+                  </m:e>
+                </m:mr>
+                <m:mr>
+                  <m:e>
+                    <m:sSub>
+                      <m:e>
+                        <m:r>
+                          <m:t xml:space="preserve"> a</m:t>
+                        </m:r>
+                      </m:e>
+                      <m:sub>
+                        <m:r>
+                          <m:t xml:space="preserve">m1</m:t>
+                        </m:r>
+                      </m:sub>
+                    </m:sSub>
+                    <m:r>
+                      <m:t xml:space="preserve"> </m:t>
+                    </m:r>
+                  </m:e>
+                  <m:e>
+                    <m:r>
+                      <m:t xml:space="preserve"> </m:t>
+                    </m:r>
+                    <m:r>
+                      <m:t xml:space="preserve">⋯</m:t>
+                    </m:r>
+                    <m:r>
+                      <m:t xml:space="preserve"> </m:t>
+                    </m:r>
+                  </m:e>
+                  <m:e>
+                    <m:sSub>
+                      <m:e>
+                        <m:r>
+                          <m:t xml:space="preserve"> a</m:t>
+                        </m:r>
+                      </m:e>
+                      <m:sub>
+                        <m:r>
+                          <m:t xml:space="preserve">mn</m:t>
+                        </m:r>
+                      </m:sub>
+                    </m:sSub>
+                    <m:r>
+                      <m:t xml:space="preserve"> </m:t>
+                    </m:r>
+                  </m:e>
+                </m:mr>
+              </m:m>
+            </m:e>
+          </m:d>
+          <m:r>
+            <m:t xml:space="preserve">, </m:t>
+          </m:r>
+          <m:r>
+            <m:t xml:space="preserve"> </m:t>
+          </m:r>
+          <m:sSub>
+            <m:e>
+              <m:r>
+                <m:t xml:space="preserve"> x</m:t>
+              </m:r>
+            </m:e>
+            <m:sub>
+              <m:r>
+                <m:t xml:space="preserve">1</m:t>
+              </m:r>
+            </m:sub>
+          </m:sSub>
+          <m:sSub>
+            <m:e>
+              <m:r>
+                <m:t xml:space="preserve">, x</m:t>
+              </m:r>
+            </m:e>
+            <m:sub>
+              <m:r>
+                <m:t xml:space="preserve">2</m:t>
+              </m:r>
+            </m:sub>
+          </m:sSub>
+          <m:r>
+            <m:t xml:space="preserve">, </m:t>
+          </m:r>
+          <m:r>
+            <m:t xml:space="preserve">…</m:t>
+          </m:r>
+          <m:sSub>
+            <m:e>
+              <m:r>
+                <m:t xml:space="preserve">, x</m:t>
+              </m:r>
+            </m:e>
+            <m:sub>
+              <m:r>
+                <m:t xml:space="preserve">n</m:t>
+              </m:r>
+            </m:sub>
+          </m:sSub>
+        </m:oMath>
+      </m:oMathPara>
+    </w:p>
+    <w:p>
+      <w:pPr/>
+      <w:r>
+        <w:rPr/>
+        <w:t xml:space="preserve">52. Spacing Control (quad / qquad / thinsp):</w:t>
+      </w:r>
+    </w:p>
+    <w:p>
+      <m:oMathPara>
+        <m:oMath>
+          <m:r>
+            <m:t xml:space="preserve">a + b </m:t>
+          </m:r>
+          <m:r>
+            <m:t xml:space="preserve"> </m:t>
+          </m:r>
+          <m:r>
+            <m:t xml:space="preserve"> c </m:t>
+          </m:r>
+          <m:r>
+            <m:t xml:space="preserve"> </m:t>
+          </m:r>
+          <m:r>
+            <m:t xml:space="preserve"> d </m:t>
+          </m:r>
+          <m:r>
+            <m:t xml:space="preserve"> </m:t>
+          </m:r>
+          <m:r>
+            <m:t xml:space="preserve"> e </m:t>
+          </m:r>
+          <m:r>
+            <m:t xml:space="preserve">  </m:t>
+          </m:r>
+          <m:r>
+            <m:t xml:space="preserve"> f</m:t>
+          </m:r>
+        </m:oMath>
+      </m:oMathPara>
+    </w:p>
+    <w:p>
+      <w:pPr/>
+      <w:r>
+        <w:rPr/>
+        <w:t xml:space="preserve">53. Colored Math (textcolor / color):</w:t>
+      </w:r>
+    </w:p>
+    <w:p>
+      <m:oMathPara>
+        <m:oMath>
+          <m:sSup>
+            <m:e>
+              <m:r>
+                <w:rPr>
+                  <w:color w:val="FF0000"/>
+                </w:rPr>
+                <m:t xml:space="preserve">x</m:t>
+              </m:r>
+            </m:e>
+            <m:sup>
+              <m:r>
+                <w:rPr>
+                  <w:color w:val="FF0000"/>
+                </w:rPr>
+                <m:t xml:space="preserve">2</m:t>
+              </m:r>
+            </m:sup>
+          </m:sSup>
+          <m:r>
+            <m:t xml:space="preserve"> + </m:t>
+          </m:r>
+          <m:r>
+            <w:rPr>
+              <w:color w:val="0000FF"/>
+            </w:rPr>
+            <m:t xml:space="preserve">2xy</m:t>
+          </m:r>
+          <m:r>
+            <m:t xml:space="preserve"> + </m:t>
+          </m:r>
+          <m:sSup>
+            <m:e>
+              <m:r>
+                <w:rPr>
+                  <w:color w:val="008000"/>
+                </w:rPr>
+                <m:t xml:space="preserve">y</m:t>
+              </m:r>
+            </m:e>
+            <m:sup>
+              <m:r>
+                <w:rPr>
+                  <w:color w:val="008000"/>
+                </w:rPr>
+                <m:t xml:space="preserve">2</m:t>
+              </m:r>
+            </m:sup>
+          </m:sSup>
+          <m:r>
+            <m:t xml:space="preserve"> = </m:t>
+          </m:r>
+          <m:sSup>
+            <m:e>
+              <m:r>
+                <w:rPr>
+                  <w:color w:val="800080"/>
+                </w:rPr>
+                <m:t xml:space="preserve">(x+y)</m:t>
+              </m:r>
+            </m:e>
+            <m:sup>
+              <m:r>
+                <w:rPr>
+                  <w:color w:val="800080"/>
+                </w:rPr>
+                <m:t xml:space="preserve">2</m:t>
+              </m:r>
+            </m:sup>
+          </m:sSup>
+        </m:oMath>
+      </m:oMathPara>
+    </w:p>
+    <w:p>
+      <w:pPr/>
+      <w:r>
+        <w:rPr/>
+        <w:t xml:space="preserve">54. Set Theory:</w:t>
+      </w:r>
+    </w:p>
+    <w:p>
+      <m:oMathPara>
+        <m:oMath>
+          <m:r>
+            <m:t xml:space="preserve">A </m:t>
+          </m:r>
+          <m:r>
+            <m:t xml:space="preserve">⊆</m:t>
+          </m:r>
+          <m:r>
+            <m:t xml:space="preserve"> B </m:t>
+          </m:r>
+          <m:r>
+            <m:t xml:space="preserve">⟺</m:t>
+          </m:r>
+          <m:r>
+            <m:t xml:space="preserve"> </m:t>
+          </m:r>
+          <m:r>
+            <m:t xml:space="preserve">∀</m:t>
+          </m:r>
+          <m:r>
+            <m:t xml:space="preserve"> x </m:t>
+          </m:r>
+          <m:r>
+            <m:t xml:space="preserve">∈</m:t>
+          </m:r>
+          <m:r>
+            <m:t xml:space="preserve"> A, x </m:t>
+          </m:r>
+          <m:r>
+            <m:t xml:space="preserve">∈</m:t>
+          </m:r>
+          <m:r>
+            <m:t xml:space="preserve"> B; </m:t>
+          </m:r>
+          <m:r>
+            <m:t xml:space="preserve"> </m:t>
+          </m:r>
+          <m:r>
+            <m:t xml:space="preserve"> A </m:t>
+          </m:r>
+          <m:r>
+            <m:t xml:space="preserve">∖</m:t>
+          </m:r>
+          <m:r>
+            <m:t xml:space="preserve"> B = </m:t>
+          </m:r>
+          <m:r>
+            <m:t xml:space="preserve">{</m:t>
+          </m:r>
+          <m:r>
+            <m:t xml:space="preserve">x : x </m:t>
+          </m:r>
+          <m:r>
+            <m:t xml:space="preserve">∈</m:t>
+          </m:r>
+          <m:r>
+            <m:t xml:space="preserve"> A </m:t>
+          </m:r>
+          <m:r>
+            <m:t xml:space="preserve">∧</m:t>
+          </m:r>
+          <m:r>
+            <m:t xml:space="preserve"> x </m:t>
+          </m:r>
+          <m:r>
+            <m:t xml:space="preserve">∉</m:t>
+          </m:r>
+          <m:r>
+            <m:t xml:space="preserve"> B</m:t>
+          </m:r>
+          <m:r>
+            <m:t xml:space="preserve">}</m:t>
+          </m:r>
+          <m:r>
+            <m:t xml:space="preserve">; </m:t>
+          </m:r>
+          <m:r>
+            <m:t xml:space="preserve"> </m:t>
+          </m:r>
+          <m:r>
+            <m:t xml:space="preserve"> </m:t>
+          </m:r>
+          <m:r>
+            <m:t xml:space="preserve">∅</m:t>
+          </m:r>
+          <m:r>
+            <m:t xml:space="preserve"> </m:t>
+          </m:r>
+          <m:r>
+            <m:t xml:space="preserve">⊂</m:t>
+          </m:r>
+          <m:r>
+            <m:t xml:space="preserve"> A</m:t>
+          </m:r>
+        </m:oMath>
+      </m:oMathPara>
+    </w:p>
+    <w:p>
+      <w:pPr/>
+      <w:r>
+        <w:rPr/>
+        <w:t xml:space="preserve">55. Norm and Inner Product:</w:t>
+      </w:r>
+    </w:p>
+    <w:p>
+      <m:oMathPara>
+        <m:oMath>
+          <m:r>
+            <m:t xml:space="preserve">‖</m:t>
+          </m:r>
+          <m:r>
+            <m:t xml:space="preserve">x</m:t>
+          </m:r>
+          <m:sSub>
+            <m:e>
+              <m:r>
+                <m:t xml:space="preserve">‖</m:t>
+              </m:r>
+            </m:e>
+            <m:sub>
+              <m:r>
+                <m:t xml:space="preserve">2</m:t>
+              </m:r>
+            </m:sub>
+          </m:sSub>
+          <m:r>
+            <m:t xml:space="preserve"> = </m:t>
+          </m:r>
+          <m:rad>
+            <m:radPr>
+              <m:degHide m:val="true"/>
+            </m:radPr>
+            <m:deg/>
+            <m:e>
+              <m:r>
+                <m:t xml:space="preserve">⟨</m:t>
+              </m:r>
+              <m:r>
+                <m:t xml:space="preserve"> x, x </m:t>
+              </m:r>
+              <m:r>
+                <m:t xml:space="preserve">⟩</m:t>
+              </m:r>
+            </m:e>
+          </m:rad>
+          <m:r>
+            <m:t xml:space="preserve"> = </m:t>
+          </m:r>
+          <m:rad>
+            <m:radPr>
+              <m:degHide m:val="true"/>
+            </m:radPr>
+            <m:deg/>
+            <m:e>
+              <m:sSubSup>
+                <m:e>
+                  <m:nary>
+                    <m:naryPr>
+                      <m:chr m:val="∑"/>
+                    </m:naryPr>
+                    <m:sub>
+                      <m:r>
+                        <m:t xml:space="preserve">i=1</m:t>
+                      </m:r>
+                    </m:sub>
+                    <m:sup>
+                      <m:r>
+                        <m:t xml:space="preserve">n</m:t>
+                      </m:r>
+                    </m:sup>
+                    <m:e>
+                      <m:r>
+                        <m:t xml:space="preserve">x</m:t>
+                      </m:r>
+                    </m:e>
+                  </m:nary>
+                </m:e>
+                <m:sub>
+                  <m:r>
+                    <m:t xml:space="preserve">i</m:t>
+                  </m:r>
+                </m:sub>
+                <m:sup>
+                  <m:r>
+                    <m:t xml:space="preserve">2</m:t>
+                  </m:r>
+                </m:sup>
+              </m:sSubSup>
+            </m:e>
+          </m:rad>
+        </m:oMath>
+      </m:oMathPara>
+    </w:p>
     <w:sectPr>
       <w:pgSz w:w="11906" w:h="16838"/>
       <w:pgMar w:top="1440" w:right="1800" w:bottom="1440" w:left="1800"/>
@@ -2467,10 +4758,128 @@
   <w:docDefaults>
     <w:rPrDefault>
       <w:rPr>
-        <w:rFonts w:ascii="Times New Roman" w:hAnsi="Times New Roman"/>
+        <w:rFonts w:ascii="Calibri" w:hAnsi="Calibri"/>
+        <w:sz w:val="22"/>
+        <w:szCs w:val="22"/>
       </w:rPr>
     </w:rPrDefault>
     <w:pPrDefault/>
   </w:docDefaults>
+  <w:style w:type="paragraph" w:styleId="Normal" w:default="true">
+    <w:name w:val="Normal"/>
+    <w:qFormat/>
+    <w:pPr>
+      <w:spacing w:after="0" w:line="259" w:lineRule="auto"/>
+    </w:pPr>
+  </w:style>
 </w:styles>
+</file>
+
+<file path=word/theme/theme1.xml><?xml version="1.0" encoding="utf-8"?>
+<a:theme xmlns:a="http://schemas.openxmlformats.org/drawingml/2006/main" name="Office Theme">
+  <a:themeElements>
+    <a:clrScheme name="Office">
+      <a:dk1>
+        <a:sysClr val="windowText" lastClr="000000"/>
+      </a:dk1>
+      <a:lt1>
+        <a:sysClr val="window" lastClr="FFFFFF"/>
+      </a:lt1>
+      <a:dk2>
+        <a:srgbClr val="44546A"/>
+      </a:dk2>
+      <a:lt2>
+        <a:srgbClr val="E7E6E6"/>
+      </a:lt2>
+      <a:accent1>
+        <a:srgbClr val="4472C4"/>
+      </a:accent1>
+      <a:accent2>
+        <a:srgbClr val="ED7D31"/>
+      </a:accent2>
+      <a:accent3>
+        <a:srgbClr val="A5A5A5"/>
+      </a:accent3>
+      <a:accent4>
+        <a:srgbClr val="FFC000"/>
+      </a:accent4>
+      <a:accent5>
+        <a:srgbClr val="5B9BD5"/>
+      </a:accent5>
+      <a:accent6>
+        <a:srgbClr val="70AD47"/>
+      </a:accent6>
+      <a:hlink>
+        <a:srgbClr val="0563C1"/>
+      </a:hlink>
+      <a:folHlink>
+        <a:srgbClr val="954F72"/>
+      </a:folHlink>
+    </a:clrScheme>
+    <a:fontScheme name="Office">
+      <a:majorFont>
+        <a:latin typeface="Calibri Light"/>
+        <a:ea typeface=""/>
+        <a:cs typeface=""/>
+      </a:majorFont>
+      <a:minorFont>
+        <a:latin typeface="Calibri"/>
+        <a:ea typeface=""/>
+        <a:cs typeface=""/>
+      </a:minorFont>
+    </a:fontScheme>
+    <a:fmtScheme name="Office">
+      <a:fillStyleLst>
+        <a:solidFill>
+          <a:schemeClr val="phClr"/>
+        </a:solidFill>
+        <a:solidFill>
+          <a:schemeClr val="phClr"/>
+        </a:solidFill>
+        <a:solidFill>
+          <a:schemeClr val="phClr"/>
+        </a:solidFill>
+      </a:fillStyleLst>
+      <a:lnStyleLst>
+        <a:ln w="6350" cap="flat">
+          <a:solidFill>
+            <a:schemeClr val="phClr"/>
+          </a:solidFill>
+        </a:ln>
+        <a:ln w="12700" cap="flat">
+          <a:solidFill>
+            <a:schemeClr val="phClr"/>
+          </a:solidFill>
+        </a:ln>
+        <a:ln w="19050" cap="flat">
+          <a:solidFill>
+            <a:schemeClr val="phClr"/>
+          </a:solidFill>
+        </a:ln>
+      </a:lnStyleLst>
+      <a:effectStyleLst>
+        <a:effectStyle>
+          <a:effectLst/>
+        </a:effectStyle>
+        <a:effectStyle>
+          <a:effectLst/>
+        </a:effectStyle>
+        <a:effectStyle>
+          <a:effectLst/>
+        </a:effectStyle>
+      </a:effectStyleLst>
+      <a:bgFillStyleLst>
+        <a:solidFill>
+          <a:schemeClr val="phClr"/>
+        </a:solidFill>
+        <a:solidFill>
+          <a:schemeClr val="phClr"/>
+        </a:solidFill>
+        <a:solidFill>
+          <a:schemeClr val="phClr"/>
+        </a:solidFill>
+      </a:bgFillStyleLst>
+    </a:fmtScheme>
+  </a:themeElements>
+</a:theme>
 </file>
</xml_diff>

<commit_message>
fix(docx/formula): consume \sum/\int base across the inter-token whitespace
LaTeX like `\sum_{n=1}^{\infty} \frac{1}{n^s}` rendered with an empty
dotted placeholder between the summation symbol and the fraction, with
`\frac` floating as a sibling outside `<m:e/>` instead of being the
summand.

Root cause: the tokeniser collects the space between `\infty}` and
`\frac` into a standalone Text(" "). The n-ary base parser then called
ParseSingleArg on that whitespace token, which strips leading whitespace
and returns an empty run for a pure-whitespace token. The base was
therefore emitted as empty and `\frac` was parsed as the next sibling.

Fix: in the `\sum`/`\int`/`\iint`/`\iiint`/`\prod`/`\coprod`/`\bigcup`/
`\bigcap` branch, skip any pure-whitespace Text tokens between the
sub/sup limits and the base expression. The fraction (or whatever
follows the limits) now lands inside `<m:e/>` and Word renders it as the
summand without the empty box.
</commit_message>
<xml_diff>
--- a/examples/word/formulas.docx
+++ b/examples/word/formulas.docx
@@ -118,31 +118,28 @@
               </m:r>
             </m:sup>
             <m:e>
-              <m:r>
-                <m:t xml:space="preserve"/>
-              </m:r>
+              <m:d>
+                <m:dPr/>
+                <m:e>
+                  <m:f>
+                    <m:fPr>
+                      <m:type m:val="noBar"/>
+                    </m:fPr>
+                    <m:num>
+                      <m:r>
+                        <m:t xml:space="preserve">n</m:t>
+                      </m:r>
+                    </m:num>
+                    <m:den>
+                      <m:r>
+                        <m:t xml:space="preserve">k</m:t>
+                      </m:r>
+                    </m:den>
+                  </m:f>
+                </m:e>
+              </m:d>
             </m:e>
           </m:nary>
-          <m:d>
-            <m:dPr/>
-            <m:e>
-              <m:f>
-                <m:fPr>
-                  <m:type m:val="noBar"/>
-                </m:fPr>
-                <m:num>
-                  <m:r>
-                    <m:t xml:space="preserve">n</m:t>
-                  </m:r>
-                </m:num>
-                <m:den>
-                  <m:r>
-                    <m:t xml:space="preserve">k</m:t>
-                  </m:r>
-                </m:den>
-              </m:f>
-            </m:e>
-          </m:d>
           <m:sSup>
             <m:e>
               <m:r>
@@ -386,35 +383,32 @@
               </m:r>
             </m:sup>
             <m:e>
-              <m:r>
-                <m:t xml:space="preserve"/>
-              </m:r>
+              <m:f>
+                <m:num>
+                  <m:sSup>
+                    <m:e>
+                      <m:r>
+                        <m:t xml:space="preserve">f</m:t>
+                      </m:r>
+                    </m:e>
+                    <m:sup>
+                      <m:r>
+                        <m:t xml:space="preserve">(n)</m:t>
+                      </m:r>
+                    </m:sup>
+                  </m:sSup>
+                  <m:r>
+                    <m:t xml:space="preserve">(a)</m:t>
+                  </m:r>
+                </m:num>
+                <m:den>
+                  <m:r>
+                    <m:t xml:space="preserve">n!</m:t>
+                  </m:r>
+                </m:den>
+              </m:f>
             </m:e>
           </m:nary>
-          <m:f>
-            <m:num>
-              <m:sSup>
-                <m:e>
-                  <m:r>
-                    <m:t xml:space="preserve">f</m:t>
-                  </m:r>
-                </m:e>
-                <m:sup>
-                  <m:r>
-                    <m:t xml:space="preserve">(n)</m:t>
-                  </m:r>
-                </m:sup>
-              </m:sSup>
-              <m:r>
-                <m:t xml:space="preserve">(a)</m:t>
-              </m:r>
-            </m:num>
-            <m:den>
-              <m:r>
-                <m:t xml:space="preserve">n!</m:t>
-              </m:r>
-            </m:den>
-          </m:f>
           <m:sSup>
             <m:e>
               <m:r>
@@ -953,32 +947,29 @@
               </m:r>
             </m:sup>
             <m:e>
-              <m:r>
-                <m:t xml:space="preserve"/>
-              </m:r>
+              <m:f>
+                <m:num>
+                  <m:r>
+                    <m:t xml:space="preserve">1</m:t>
+                  </m:r>
+                </m:num>
+                <m:den>
+                  <m:sSup>
+                    <m:e>
+                      <m:r>
+                        <m:t xml:space="preserve">n</m:t>
+                      </m:r>
+                    </m:e>
+                    <m:sup>
+                      <m:r>
+                        <m:t xml:space="preserve">s</m:t>
+                      </m:r>
+                    </m:sup>
+                  </m:sSup>
+                </m:den>
+              </m:f>
             </m:e>
           </m:nary>
-          <m:f>
-            <m:num>
-              <m:r>
-                <m:t xml:space="preserve">1</m:t>
-              </m:r>
-            </m:num>
-            <m:den>
-              <m:sSup>
-                <m:e>
-                  <m:r>
-                    <m:t xml:space="preserve">n</m:t>
-                  </m:r>
-                </m:e>
-                <m:sup>
-                  <m:r>
-                    <m:t xml:space="preserve">s</m:t>
-                  </m:r>
-                </m:sup>
-              </m:sSup>
-            </m:den>
-          </m:f>
         </m:oMath>
       </m:oMathPara>
     </w:p>
@@ -3709,32 +3700,29 @@
               </m:r>
             </m:sup>
             <m:e>
-              <m:r>
-                <m:t xml:space="preserve"/>
-              </m:r>
+              <m:f>
+                <m:num>
+                  <m:r>
+                    <m:t xml:space="preserve">dt</m:t>
+                  </m:r>
+                </m:num>
+                <m:den>
+                  <m:sSup>
+                    <m:e>
+                      <m:r>
+                        <m:t xml:space="preserve">1+t</m:t>
+                      </m:r>
+                    </m:e>
+                    <m:sup>
+                      <m:r>
+                        <m:t xml:space="preserve">2</m:t>
+                      </m:r>
+                    </m:sup>
+                  </m:sSup>
+                </m:den>
+              </m:f>
             </m:e>
           </m:nary>
-          <m:f>
-            <m:num>
-              <m:r>
-                <m:t xml:space="preserve">dt</m:t>
-              </m:r>
-            </m:num>
-            <m:den>
-              <m:sSup>
-                <m:e>
-                  <m:r>
-                    <m:t xml:space="preserve">1+t</m:t>
-                  </m:r>
-                </m:e>
-                <m:sup>
-                  <m:r>
-                    <m:t xml:space="preserve">2</m:t>
-                  </m:r>
-                </m:sup>
-              </m:sSup>
-            </m:den>
-          </m:f>
           <m:r>
             <m:t xml:space="preserve">, </m:t>
           </m:r>

</xml_diff>